<commit_message>
docs: actualizar documentación Aurora al corte vigente
</commit_message>
<xml_diff>
--- a/GUIA_DESPLIEGUE_AURORA.docx
+++ b/GUIA_DESPLIEGUE_AURORA.docx
@@ -294,6 +294,15 @@
       </w:r>
     </w:p>
     <w:p>
+      <w:r>
+        <w:rPr>
+          <w:b/>
+          <w:color w:val="073763"/>
+        </w:rPr>
+        <w:t>Estado documental: vigente al 20 de agosto de 2026. Versión 1.3.</w:t>
+      </w:r>
+    </w:p>
+    <w:p>
       <w:pPr>
         <w:pStyle w:val="Ttulo1"/>
         <w:spacing w:before="0"/>
@@ -868,6 +877,58 @@
                 <w:color w:val="1F2937"/>
                 <w:sz w:val="14"/>
               </w:rPr>
+              <w:t>Pendiente aprobación institucional</w:t>
+            </w:r>
+          </w:p>
+        </w:tc>
+      </w:tr>
+      <w:tr>
+        <w:tc>
+          <w:tcPr>
+            <w:tcW w:type="dxa" w:w="907"/>
+          </w:tcPr>
+          <w:p>
+            <w:r>
+              <w:t>1.3</w:t>
+            </w:r>
+          </w:p>
+        </w:tc>
+        <w:tc>
+          <w:tcPr>
+            <w:tcW w:type="dxa" w:w="1359"/>
+          </w:tcPr>
+          <w:p>
+            <w:r>
+              <w:t>2026-08-20</w:t>
+            </w:r>
+          </w:p>
+        </w:tc>
+        <w:tc>
+          <w:tcPr>
+            <w:tcW w:type="dxa" w:w="2268"/>
+          </w:tcPr>
+          <w:p>
+            <w:r>
+              <w:t>Dirección Nacional de Defensoría Pública (DNDP) - Grupo de Transformación Digital</w:t>
+            </w:r>
+          </w:p>
+        </w:tc>
+        <w:tc>
+          <w:tcPr>
+            <w:tcW w:type="dxa" w:w="3970"/>
+          </w:tcPr>
+          <w:p>
+            <w:r>
+              <w:t>Actualización de puertos, volúmenes, autenticación, variables, healthcheck y validación del despliegue vigente.</w:t>
+            </w:r>
+          </w:p>
+        </w:tc>
+        <w:tc>
+          <w:tcPr>
+            <w:tcW w:type="dxa" w:w="1077"/>
+          </w:tcPr>
+          <w:p>
+            <w:r>
               <w:t>Pendiente aprobación institucional</w:t>
             </w:r>
           </w:p>
@@ -20178,6 +20239,247 @@
           <w:lang w:val="es-CO"/>
         </w:rPr>
       </w:pPr>
+    </w:p>
+    <w:p>
+      <w:r>
+        <w:br w:type="page"/>
+      </w:r>
+    </w:p>
+    <w:p>
+      <w:pPr>
+        <w:pStyle w:val="Ttulo1"/>
+      </w:pPr>
+      <w:r>
+        <w:rPr>
+          <w:color w:val="073763"/>
+        </w:rPr>
+        <w:t>Actualización técnica y funcional al 20 de agosto de 2026</w:t>
+      </w:r>
+    </w:p>
+    <w:p>
+      <w:r>
+        <w:t>Este capítulo conserva como antecedente todo el contenido anterior y establece la interpretación vigente cuando exista una diferencia con secciones históricas. El corte corresponde a la rama master en e4ee2f7.</w:t>
+      </w:r>
+    </w:p>
+    <w:p>
+      <w:pPr>
+        <w:pStyle w:val="Ttulo2"/>
+      </w:pPr>
+      <w:r>
+        <w:rPr>
+          <w:color w:val="073763"/>
+        </w:rPr>
+        <w:t>Configuración productiva vigente</w:t>
+      </w:r>
+    </w:p>
+    <w:p>
+      <w:pPr>
+        <w:pStyle w:val="Listaconvietas"/>
+        <w:spacing w:after="100"/>
+      </w:pPr>
+      <w:r>
+        <w:t>Aurora se publica exclusivamente por HTTPS en el puerto 443 para usuarios y equipos cliente. La URL institucional no debe incluir :7860. PORT=7860 identifica solamente el proceso Node.js dentro del contenedor y no debe exponerse en firewall, DNS, proxy ni documentación dirigida al usuario.</w:t>
+      </w:r>
+    </w:p>
+    <w:p>
+      <w:pPr>
+        <w:pStyle w:val="Listaconvietas"/>
+        <w:spacing w:after="100"/>
+      </w:pPr>
+      <w:r>
+        <w:t>Docker Compose crea los volúmenes aurora_auth_users y aurora_cargas_bd. No usar docker compose down -v durante una actualización ordinaria porque eliminaría el estado persistente.</w:t>
+      </w:r>
+    </w:p>
+    <w:p>
+      <w:pPr>
+        <w:pStyle w:val="Listaconvietas"/>
+        <w:spacing w:after="100"/>
+      </w:pPr>
+      <w:r>
+        <w:t>El healthcheck selecciona HTTP o HTTPS según HTTPS_KEY_PATH y HTTPS_CERT_PATH y consulta /api/health dentro del contenedor.</w:t>
+      </w:r>
+    </w:p>
+    <w:p>
+      <w:pPr>
+        <w:pStyle w:val="Ttulo2"/>
+      </w:pPr>
+      <w:r>
+        <w:rPr>
+          <w:color w:val="073763"/>
+        </w:rPr>
+        <w:t>Variables que deben revisarse en cada ambiente</w:t>
+      </w:r>
+    </w:p>
+    <w:p>
+      <w:pPr>
+        <w:pStyle w:val="Listaconvietas"/>
+        <w:spacing w:after="100"/>
+      </w:pPr>
+      <w:r>
+        <w:t>Identidad: AZURE_AD_*, LDAP_*, AUTH_USER_ACCESS_MODE, AUTH_BOOTSTRAP_ADMIN_EMAILS y AUTH_USER_SYNC_REQUIRED.</w:t>
+      </w:r>
+    </w:p>
+    <w:p>
+      <w:pPr>
+        <w:pStyle w:val="Listaconvietas"/>
+        <w:spacing w:after="100"/>
+      </w:pPr>
+      <w:r>
+        <w:t>Persistencia: AUTH_USER_STORE_PATH, AURORA_CARGAS_DIR y AURORA_CARGAS_TMP_DIR.</w:t>
+      </w:r>
+    </w:p>
+    <w:p>
+      <w:pPr>
+        <w:pStyle w:val="Listaconvietas"/>
+        <w:spacing w:after="100"/>
+      </w:pPr>
+      <w:r>
+        <w:t>Cargas: límites de archivo, retención, cantidad de registros, reparación, limpieza controlada y procedimiento SISIPEC.</w:t>
+      </w:r>
+    </w:p>
+    <w:p>
+      <w:pPr>
+        <w:pStyle w:val="Listaconvietas"/>
+        <w:spacing w:after="100"/>
+      </w:pPr>
+      <w:r>
+        <w:t>Publicación: HOST_PORT, PORT, CORS_ORIGIN, HTTPS_KEY_PATH y HTTPS_CERT_PATH.</w:t>
+      </w:r>
+    </w:p>
+    <w:p>
+      <w:pPr>
+        <w:pStyle w:val="Ttulo2"/>
+      </w:pPr>
+      <w:r>
+        <w:rPr>
+          <w:color w:val="073763"/>
+        </w:rPr>
+        <w:t>Secuencia de actualización recomendada</w:t>
+      </w:r>
+    </w:p>
+    <w:p>
+      <w:pPr>
+        <w:pStyle w:val="Listaconvietas"/>
+        <w:spacing w:after="100"/>
+      </w:pPr>
+      <w:r>
+        <w:t>Respaldar .env, directorio de usuarios, historial/logs de cargas y cualquier volumen administrado antes de actualizar.</w:t>
+      </w:r>
+    </w:p>
+    <w:p>
+      <w:pPr>
+        <w:pStyle w:val="Listaconvietas"/>
+        <w:spacing w:after="100"/>
+      </w:pPr>
+      <w:r>
+        <w:t>Ejecutar docker compose config --quiet y docker compose build aurora.</w:t>
+      </w:r>
+    </w:p>
+    <w:p>
+      <w:pPr>
+        <w:pStyle w:val="Listaconvietas"/>
+        <w:spacing w:after="100"/>
+      </w:pPr>
+      <w:r>
+        <w:t>Aplicar docker compose up -d --force-recreate aurora cuando cambie .env; usar --build cuando cambie código o dependencias.</w:t>
+      </w:r>
+    </w:p>
+    <w:p>
+      <w:pPr>
+        <w:pStyle w:val="Listaconvietas"/>
+        <w:spacing w:after="100"/>
+      </w:pPr>
+      <w:r>
+        <w:t>Validar docker compose ps, /api/health, /api/health/db y /api/auth/config; después ejecutar login, consulta, formulario, reportes, asignación, formatos y módulos administrativos según rol.</w:t>
+      </w:r>
+    </w:p>
+    <w:p>
+      <w:pPr>
+        <w:pStyle w:val="Ttulo2"/>
+      </w:pPr>
+      <w:r>
+        <w:rPr>
+          <w:color w:val="073763"/>
+        </w:rPr>
+        <w:t>Advertencia sobre referencias históricas</w:t>
+      </w:r>
+    </w:p>
+    <w:p>
+      <w:pPr>
+        <w:spacing w:after="100"/>
+      </w:pPr>
+      <w:r>
+        <w:t>Las direcciones 172.31.64.7, localhost y los puertos 7860/8787 documentados previamente son evidencias o ejemplos de pruebas de mayo y junio. No constituyen la URL productiva vigente.</w:t>
+      </w:r>
+    </w:p>
+    <w:p>
+      <w:pPr>
+        <w:spacing w:after="100"/>
+      </w:pPr>
+      <w:r>
+        <w:t>PM2 se mantiene únicamente como alternativa Node.js directa aprobada por Infraestructura; no debe administrar en paralelo el proceso que ejecuta Docker Compose.</w:t>
+      </w:r>
+    </w:p>
+    <w:p>
+      <w:pPr>
+        <w:pStyle w:val="Ttulo2"/>
+      </w:pPr>
+      <w:r>
+        <w:rPr>
+          <w:color w:val="073763"/>
+        </w:rPr>
+        <w:t>Diagramas vigentes</w:t>
+      </w:r>
+    </w:p>
+    <w:p>
+      <w:pPr>
+        <w:jc w:val="center"/>
+      </w:pPr>
+      <w:r>
+        <w:drawing>
+          <wp:inline xmlns:a="http://schemas.openxmlformats.org/drawingml/2006/main" xmlns:pic="http://schemas.openxmlformats.org/drawingml/2006/picture">
+            <wp:extent cx="6217920" cy="3454400"/>
+            <wp:docPr id="4" name="Picture 4"/>
+            <wp:cNvGraphicFramePr>
+              <a:graphicFrameLocks noChangeAspect="1"/>
+            </wp:cNvGraphicFramePr>
+            <a:graphic>
+              <a:graphicData uri="http://schemas.openxmlformats.org/drawingml/2006/picture">
+                <pic:pic>
+                  <pic:nvPicPr>
+                    <pic:cNvPr id="0" name="03_despliegue_aurora.png"/>
+                    <pic:cNvPicPr/>
+                  </pic:nvPicPr>
+                  <pic:blipFill>
+                    <a:blip r:embed="rId19"/>
+                    <a:stretch>
+                      <a:fillRect/>
+                    </a:stretch>
+                  </pic:blipFill>
+                  <pic:spPr>
+                    <a:xfrm>
+                      <a:off x="0" y="0"/>
+                      <a:ext cx="6217920" cy="3454400"/>
+                    </a:xfrm>
+                    <a:prstGeom prst="rect"/>
+                  </pic:spPr>
+                </pic:pic>
+              </a:graphicData>
+            </a:graphic>
+          </wp:inline>
+        </w:drawing>
+      </w:r>
+    </w:p>
+    <w:p>
+      <w:pPr>
+        <w:jc w:val="center"/>
+      </w:pPr>
+      <w:r>
+        <w:rPr>
+          <w:i/>
+        </w:rPr>
+        <w:t>Figura actualizada al 20 de agosto de 2026: 03 despliegue aurora.</w:t>
+      </w:r>
     </w:p>
     <w:sectPr>
       <w:headerReference w:type="even" r:id="rId11"/>

</xml_diff>